<commit_message>
create post page; add images; edit report
</commit_message>
<xml_diff>
--- a/reports/report.docx
+++ b/reports/report.docx
@@ -326,6 +326,7 @@
         </w:rPr>
         <w:t xml:space="preserve">: </w:t>
       </w:r>
+      <w:proofErr w:type="spellStart"/>
       <w:r>
         <w:rPr>
           <w:rFonts w:ascii="Times New Roman" w:eastAsia="Times New Roman" w:hAnsi="Times New Roman" w:cs="Times New Roman"/>
@@ -333,8 +334,9 @@
           <w:sz w:val="28"/>
           <w:lang w:eastAsia="en-US" w:bidi="en-US"/>
         </w:rPr>
-        <w:t xml:space="preserve">Лунюшин Дмитрий Павлович </w:t>
-      </w:r>
+        <w:t>Лунюшин</w:t>
+      </w:r>
+      <w:proofErr w:type="spellEnd"/>
       <w:r>
         <w:rPr>
           <w:rFonts w:ascii="Times New Roman" w:eastAsia="Times New Roman" w:hAnsi="Times New Roman" w:cs="Times New Roman"/>
@@ -342,9 +344,17 @@
           <w:sz w:val="28"/>
           <w:lang w:eastAsia="en-US" w:bidi="en-US"/>
         </w:rPr>
+        <w:t xml:space="preserve"> Дмитрий Павлович </w:t>
+      </w:r>
+      <w:r>
+        <w:rPr>
+          <w:rFonts w:ascii="Times New Roman" w:eastAsia="Times New Roman" w:hAnsi="Times New Roman" w:cs="Times New Roman"/>
+          <w:color w:val="000000"/>
+          <w:sz w:val="28"/>
+          <w:lang w:eastAsia="en-US" w:bidi="en-US"/>
+        </w:rPr>
         <w:t xml:space="preserve">Группа: </w:t>
       </w:r>
-      <w:proofErr w:type="gramStart"/>
       <w:r>
         <w:rPr>
           <w:rFonts w:ascii="Times New Roman" w:eastAsia="Times New Roman" w:hAnsi="Times New Roman" w:cs="Times New Roman"/>
@@ -354,7 +364,6 @@
         </w:rPr>
         <w:t>251-332</w:t>
       </w:r>
-      <w:proofErr w:type="gramEnd"/>
     </w:p>
     <w:p>
       <w:pPr>
@@ -1430,8 +1439,8 @@
           <w:b/>
           <w:bCs/>
           <w:color w:val="000000"/>
-          <w:sz w:val="28"/>
-          <w:szCs w:val="28"/>
+          <w:sz w:val="32"/>
+          <w:szCs w:val="32"/>
         </w:rPr>
         <w:lastRenderedPageBreak/>
         <w:t>ОТЧЕТ</w:t>
@@ -1472,8 +1481,8 @@
         <w:rPr>
           <w:rFonts w:ascii="Times New Roman" w:eastAsia="Times New Roman" w:hAnsi="Times New Roman" w:cs="Times New Roman"/>
           <w:color w:val="000000"/>
-          <w:sz w:val="28"/>
-          <w:szCs w:val="28"/>
+          <w:sz w:val="32"/>
+          <w:szCs w:val="32"/>
         </w:rPr>
       </w:pPr>
       <w:r>
@@ -1482,8 +1491,8 @@
           <w:b/>
           <w:bCs/>
           <w:color w:val="000000"/>
-          <w:sz w:val="28"/>
-          <w:szCs w:val="28"/>
+          <w:sz w:val="32"/>
+          <w:szCs w:val="32"/>
         </w:rPr>
         <w:t>ВВЕДЕНИЕ</w:t>
       </w:r>
@@ -1514,7 +1523,27 @@
           <w:sz w:val="28"/>
           <w:szCs w:val="28"/>
         </w:rPr>
-        <w:t>Настоящий отчет подготовлен по итогам выполнения работ по верстке веб-приложения «Видеотекст», входящего в состав исследовательско-технологической платформы «Syllabica». Практическая работа направлена на реализацию клиентской части цифрового сервиса, обеспечивающего визуализацию генетической текстологической информации. В рамках практики решались задачи по трансформации утвержденных дизайн-макетов в готовый программный интерфейс.</w:t>
+        <w:t>Настоящий отчет подготовлен по итогам выполнения работ по верстке веб-приложения «Видеотекст», входящего в состав исследовательско-технологической платформы «</w:t>
+      </w:r>
+      <w:proofErr w:type="spellStart"/>
+      <w:r>
+        <w:rPr>
+          <w:rFonts w:ascii="Times New Roman" w:eastAsia="Times New Roman" w:hAnsi="Times New Roman" w:cs="Times New Roman"/>
+          <w:color w:val="000000"/>
+          <w:sz w:val="28"/>
+          <w:szCs w:val="28"/>
+        </w:rPr>
+        <w:t>Syllabica</w:t>
+      </w:r>
+      <w:proofErr w:type="spellEnd"/>
+      <w:r>
+        <w:rPr>
+          <w:rFonts w:ascii="Times New Roman" w:eastAsia="Times New Roman" w:hAnsi="Times New Roman" w:cs="Times New Roman"/>
+          <w:color w:val="000000"/>
+          <w:sz w:val="28"/>
+          <w:szCs w:val="28"/>
+        </w:rPr>
+        <w:t>». Практическая работа направлена на реализацию клиентской части цифрового сервиса, обеспечивающего визуализацию генетической текстологической информации. В рамках практики решались задачи по трансформации утвержденных дизайн-макетов в готовый программный интерфейс.</w:t>
       </w:r>
     </w:p>
     <w:p>
@@ -1589,7 +1618,27 @@
           <w:sz w:val="28"/>
           <w:szCs w:val="28"/>
         </w:rPr>
-        <w:t> Цифровая издательская технология генетического чтения «Видеотекст» (в рамках экосистемы «Syllabica»).</w:t>
+        <w:t> Цифровая издательская технология генетического чтения «Видеотекст» (в рамках экосистемы «</w:t>
+      </w:r>
+      <w:proofErr w:type="spellStart"/>
+      <w:r>
+        <w:rPr>
+          <w:rFonts w:ascii="Times New Roman" w:eastAsia="Times New Roman" w:hAnsi="Times New Roman" w:cs="Times New Roman"/>
+          <w:color w:val="000000"/>
+          <w:sz w:val="28"/>
+          <w:szCs w:val="28"/>
+        </w:rPr>
+        <w:t>Syllabica</w:t>
+      </w:r>
+      <w:proofErr w:type="spellEnd"/>
+      <w:r>
+        <w:rPr>
+          <w:rFonts w:ascii="Times New Roman" w:eastAsia="Times New Roman" w:hAnsi="Times New Roman" w:cs="Times New Roman"/>
+          <w:color w:val="000000"/>
+          <w:sz w:val="28"/>
+          <w:szCs w:val="28"/>
+        </w:rPr>
+        <w:t>»).</w:t>
       </w:r>
     </w:p>
     <w:p>
@@ -1787,47 +1836,27 @@
           <w:sz w:val="28"/>
           <w:szCs w:val="28"/>
         </w:rPr>
-        <w:t xml:space="preserve"> Лаборатория цифровой фоностилистики и генетической текстологии (Московский политехнический университет / Институт Пушкина — на базе научной группы </w:t>
-      </w:r>
-      <w:proofErr w:type="gramStart"/>
-      <w:r>
-        <w:rPr>
-          <w:rFonts w:ascii="Times New Roman" w:eastAsia="Times New Roman" w:hAnsi="Times New Roman" w:cs="Times New Roman"/>
-          <w:color w:val="000000"/>
-          <w:sz w:val="28"/>
-          <w:szCs w:val="28"/>
-        </w:rPr>
-        <w:t>д.ф.н.</w:t>
-      </w:r>
-      <w:proofErr w:type="gramEnd"/>
-      <w:r>
-        <w:rPr>
-          <w:rFonts w:ascii="Times New Roman" w:eastAsia="Times New Roman" w:hAnsi="Times New Roman" w:cs="Times New Roman"/>
-          <w:color w:val="000000"/>
-          <w:sz w:val="28"/>
-          <w:szCs w:val="28"/>
-        </w:rPr>
-        <w:t xml:space="preserve"> </w:t>
-      </w:r>
-      <w:proofErr w:type="gramStart"/>
-      <w:r>
-        <w:rPr>
-          <w:rFonts w:ascii="Times New Roman" w:eastAsia="Times New Roman" w:hAnsi="Times New Roman" w:cs="Times New Roman"/>
-          <w:color w:val="000000"/>
-          <w:sz w:val="28"/>
-          <w:szCs w:val="28"/>
-        </w:rPr>
-        <w:t>Г.В.</w:t>
-      </w:r>
-      <w:proofErr w:type="gramEnd"/>
-      <w:r>
-        <w:rPr>
-          <w:rFonts w:ascii="Times New Roman" w:eastAsia="Times New Roman" w:hAnsi="Times New Roman" w:cs="Times New Roman"/>
-          <w:color w:val="000000"/>
-          <w:sz w:val="28"/>
-          <w:szCs w:val="28"/>
-        </w:rPr>
-        <w:t xml:space="preserve"> Векшина).</w:t>
+        <w:t xml:space="preserve"> Лаборатория цифровой </w:t>
+      </w:r>
+      <w:proofErr w:type="spellStart"/>
+      <w:r>
+        <w:rPr>
+          <w:rFonts w:ascii="Times New Roman" w:eastAsia="Times New Roman" w:hAnsi="Times New Roman" w:cs="Times New Roman"/>
+          <w:color w:val="000000"/>
+          <w:sz w:val="28"/>
+          <w:szCs w:val="28"/>
+        </w:rPr>
+        <w:t>фоностилистики</w:t>
+      </w:r>
+      <w:proofErr w:type="spellEnd"/>
+      <w:r>
+        <w:rPr>
+          <w:rFonts w:ascii="Times New Roman" w:eastAsia="Times New Roman" w:hAnsi="Times New Roman" w:cs="Times New Roman"/>
+          <w:color w:val="000000"/>
+          <w:sz w:val="28"/>
+          <w:szCs w:val="28"/>
+        </w:rPr>
+        <w:t xml:space="preserve"> и генетической текстологии (Московский политехнический университет / Институт Пушкина — на базе научной группы д.ф.н. Г.В. Векшина).</w:t>
       </w:r>
     </w:p>
     <w:p>
@@ -1862,6 +1891,7 @@
           <w:sz w:val="28"/>
           <w:szCs w:val="28"/>
         </w:rPr>
+        <w:lastRenderedPageBreak/>
         <w:t>Организационная структура:</w:t>
       </w:r>
       <w:r>
@@ -1906,7 +1936,6 @@
           <w:sz w:val="28"/>
           <w:szCs w:val="28"/>
         </w:rPr>
-        <w:lastRenderedPageBreak/>
         <w:t>Описание деятельности:</w:t>
       </w:r>
       <w:r>
@@ -1916,7 +1945,67 @@
           <w:sz w:val="28"/>
           <w:szCs w:val="28"/>
         </w:rPr>
-        <w:t> Фундаментальные и прикладные исследования в области Digital Humanities. Разработка силлабоцентрической теории текста и создание на ее базе инновационных веб-инструментов («Фонотекст», «Видеотекст») для анализа звуковой материи речи и визуализации процессов авторской правки. Деятельность направлена на внедрение методов точного анализа в филологию, копирайтинг и образование.</w:t>
+        <w:t xml:space="preserve"> Фундаментальные и прикладные исследования в области Digital </w:t>
+      </w:r>
+      <w:proofErr w:type="spellStart"/>
+      <w:r>
+        <w:rPr>
+          <w:rFonts w:ascii="Times New Roman" w:eastAsia="Times New Roman" w:hAnsi="Times New Roman" w:cs="Times New Roman"/>
+          <w:color w:val="000000"/>
+          <w:sz w:val="28"/>
+          <w:szCs w:val="28"/>
+        </w:rPr>
+        <w:t>Humanities</w:t>
+      </w:r>
+      <w:proofErr w:type="spellEnd"/>
+      <w:r>
+        <w:rPr>
+          <w:rFonts w:ascii="Times New Roman" w:eastAsia="Times New Roman" w:hAnsi="Times New Roman" w:cs="Times New Roman"/>
+          <w:color w:val="000000"/>
+          <w:sz w:val="28"/>
+          <w:szCs w:val="28"/>
+        </w:rPr>
+        <w:t xml:space="preserve">. Разработка </w:t>
+      </w:r>
+      <w:proofErr w:type="spellStart"/>
+      <w:r>
+        <w:rPr>
+          <w:rFonts w:ascii="Times New Roman" w:eastAsia="Times New Roman" w:hAnsi="Times New Roman" w:cs="Times New Roman"/>
+          <w:color w:val="000000"/>
+          <w:sz w:val="28"/>
+          <w:szCs w:val="28"/>
+        </w:rPr>
+        <w:t>силлабоцентрической</w:t>
+      </w:r>
+      <w:proofErr w:type="spellEnd"/>
+      <w:r>
+        <w:rPr>
+          <w:rFonts w:ascii="Times New Roman" w:eastAsia="Times New Roman" w:hAnsi="Times New Roman" w:cs="Times New Roman"/>
+          <w:color w:val="000000"/>
+          <w:sz w:val="28"/>
+          <w:szCs w:val="28"/>
+        </w:rPr>
+        <w:t xml:space="preserve"> теории текста и создание на ее базе инновационных веб-инструментов («</w:t>
+      </w:r>
+      <w:proofErr w:type="spellStart"/>
+      <w:r>
+        <w:rPr>
+          <w:rFonts w:ascii="Times New Roman" w:eastAsia="Times New Roman" w:hAnsi="Times New Roman" w:cs="Times New Roman"/>
+          <w:color w:val="000000"/>
+          <w:sz w:val="28"/>
+          <w:szCs w:val="28"/>
+        </w:rPr>
+        <w:t>Фонотекст</w:t>
+      </w:r>
+      <w:proofErr w:type="spellEnd"/>
+      <w:r>
+        <w:rPr>
+          <w:rFonts w:ascii="Times New Roman" w:eastAsia="Times New Roman" w:hAnsi="Times New Roman" w:cs="Times New Roman"/>
+          <w:color w:val="000000"/>
+          <w:sz w:val="28"/>
+          <w:szCs w:val="28"/>
+        </w:rPr>
+        <w:t>», «Видеотекст») для анализа звуковой материи речи и визуализации процессов авторской правки. Деятельность направлена на внедрение методов точного анализа в филологию, копирайтинг и образование.</w:t>
       </w:r>
     </w:p>
     <w:p>
@@ -1976,7 +2065,27 @@
           <w:sz w:val="28"/>
           <w:szCs w:val="28"/>
         </w:rPr>
-        <w:t>В рамках проектной практики была поставлена задача по верстке клиентской части веб-приложения «Видеотекст». Техническое задание включало перенос высокоточного дизайн-макета из Figma в HTML и CSS. Перечень требований к результату:</w:t>
+        <w:t xml:space="preserve">В рамках проектной практики была поставлена задача по верстке клиентской части веб-приложения «Видеотекст». Техническое задание включало перенос высокоточного дизайн-макета из </w:t>
+      </w:r>
+      <w:proofErr w:type="spellStart"/>
+      <w:r>
+        <w:rPr>
+          <w:rFonts w:ascii="Times New Roman" w:eastAsia="Times New Roman" w:hAnsi="Times New Roman" w:cs="Times New Roman"/>
+          <w:color w:val="000000"/>
+          <w:sz w:val="28"/>
+          <w:szCs w:val="28"/>
+        </w:rPr>
+        <w:t>Figma</w:t>
+      </w:r>
+      <w:proofErr w:type="spellEnd"/>
+      <w:r>
+        <w:rPr>
+          <w:rFonts w:ascii="Times New Roman" w:eastAsia="Times New Roman" w:hAnsi="Times New Roman" w:cs="Times New Roman"/>
+          <w:color w:val="000000"/>
+          <w:sz w:val="28"/>
+          <w:szCs w:val="28"/>
+        </w:rPr>
+        <w:t xml:space="preserve"> в HTML и CSS. Перечень требований к результату:</w:t>
       </w:r>
     </w:p>
     <w:p>
@@ -2009,7 +2118,27 @@
           <w:sz w:val="28"/>
           <w:szCs w:val="28"/>
         </w:rPr>
-        <w:t>Полное попиксельное соответствие макету (цветовая гамма адаптивной тёмной темы, типографика, сетка).</w:t>
+        <w:t xml:space="preserve">Полное </w:t>
+      </w:r>
+      <w:proofErr w:type="spellStart"/>
+      <w:r>
+        <w:rPr>
+          <w:rFonts w:ascii="Times New Roman" w:eastAsia="Times New Roman" w:hAnsi="Times New Roman" w:cs="Times New Roman"/>
+          <w:color w:val="000000"/>
+          <w:sz w:val="28"/>
+          <w:szCs w:val="28"/>
+        </w:rPr>
+        <w:t>попиксельное</w:t>
+      </w:r>
+      <w:proofErr w:type="spellEnd"/>
+      <w:r>
+        <w:rPr>
+          <w:rFonts w:ascii="Times New Roman" w:eastAsia="Times New Roman" w:hAnsi="Times New Roman" w:cs="Times New Roman"/>
+          <w:color w:val="000000"/>
+          <w:sz w:val="28"/>
+          <w:szCs w:val="28"/>
+        </w:rPr>
+        <w:t xml:space="preserve"> соответствие макету (цветовая гамма адаптивной тёмной темы, типографика, сетка).</w:t>
       </w:r>
     </w:p>
     <w:p>
@@ -2035,17 +2164,26 @@
           <w:szCs w:val="28"/>
         </w:rPr>
       </w:pPr>
-      <w:proofErr w:type="gramStart"/>
-      <w:r>
-        <w:rPr>
-          <w:rFonts w:ascii="Times New Roman" w:eastAsia="Times New Roman" w:hAnsi="Times New Roman" w:cs="Times New Roman"/>
-          <w:color w:val="000000"/>
-          <w:sz w:val="28"/>
-          <w:szCs w:val="28"/>
-        </w:rPr>
-        <w:t>Кросс-платформенность</w:t>
-      </w:r>
-      <w:proofErr w:type="gramEnd"/>
+      <w:r>
+        <w:rPr>
+          <w:rFonts w:ascii="Times New Roman" w:eastAsia="Times New Roman" w:hAnsi="Times New Roman" w:cs="Times New Roman"/>
+          <w:color w:val="000000"/>
+          <w:sz w:val="28"/>
+          <w:szCs w:val="28"/>
+        </w:rPr>
+        <w:t>Кросс-</w:t>
+      </w:r>
+      <w:proofErr w:type="spellStart"/>
+      <w:r>
+        <w:rPr>
+          <w:rFonts w:ascii="Times New Roman" w:eastAsia="Times New Roman" w:hAnsi="Times New Roman" w:cs="Times New Roman"/>
+          <w:color w:val="000000"/>
+          <w:sz w:val="28"/>
+          <w:szCs w:val="28"/>
+        </w:rPr>
+        <w:t>платформенность</w:t>
+      </w:r>
+      <w:proofErr w:type="spellEnd"/>
       <w:r>
         <w:rPr>
           <w:rFonts w:ascii="Times New Roman" w:eastAsia="Times New Roman" w:hAnsi="Times New Roman" w:cs="Times New Roman"/>
@@ -2119,7 +2257,27 @@
           <w:sz w:val="28"/>
           <w:szCs w:val="28"/>
         </w:rPr>
-        <w:t>Модульность и переиспользуемость стилей.</w:t>
+        <w:t xml:space="preserve">Модульность и </w:t>
+      </w:r>
+      <w:proofErr w:type="spellStart"/>
+      <w:r>
+        <w:rPr>
+          <w:rFonts w:ascii="Times New Roman" w:eastAsia="Times New Roman" w:hAnsi="Times New Roman" w:cs="Times New Roman"/>
+          <w:color w:val="000000"/>
+          <w:sz w:val="28"/>
+          <w:szCs w:val="28"/>
+        </w:rPr>
+        <w:t>переиспользуемость</w:t>
+      </w:r>
+      <w:proofErr w:type="spellEnd"/>
+      <w:r>
+        <w:rPr>
+          <w:rFonts w:ascii="Times New Roman" w:eastAsia="Times New Roman" w:hAnsi="Times New Roman" w:cs="Times New Roman"/>
+          <w:color w:val="000000"/>
+          <w:sz w:val="28"/>
+          <w:szCs w:val="28"/>
+        </w:rPr>
+        <w:t xml:space="preserve"> стилей.</w:t>
       </w:r>
     </w:p>
     <w:p>
@@ -2152,7 +2310,27 @@
           <w:sz w:val="28"/>
           <w:szCs w:val="28"/>
         </w:rPr>
-        <w:t>Готовность кода к интеграции с backend-логикой и JavaScript-библиотекой анимации.</w:t>
+        <w:t xml:space="preserve">Готовность кода к интеграции с </w:t>
+      </w:r>
+      <w:proofErr w:type="spellStart"/>
+      <w:r>
+        <w:rPr>
+          <w:rFonts w:ascii="Times New Roman" w:eastAsia="Times New Roman" w:hAnsi="Times New Roman" w:cs="Times New Roman"/>
+          <w:color w:val="000000"/>
+          <w:sz w:val="28"/>
+          <w:szCs w:val="28"/>
+        </w:rPr>
+        <w:t>backend</w:t>
+      </w:r>
+      <w:proofErr w:type="spellEnd"/>
+      <w:r>
+        <w:rPr>
+          <w:rFonts w:ascii="Times New Roman" w:eastAsia="Times New Roman" w:hAnsi="Times New Roman" w:cs="Times New Roman"/>
+          <w:color w:val="000000"/>
+          <w:sz w:val="28"/>
+          <w:szCs w:val="28"/>
+        </w:rPr>
+        <w:t>-логикой и JavaScript-библиотекой анимации.</w:t>
       </w:r>
     </w:p>
     <w:p>
@@ -2193,7 +2371,27 @@
           <w:szCs w:val="28"/>
         </w:rPr>
         <w:br/>
-        <w:t>В соответствии с заданием по дисциплине «Проектная деятельность» требовалось самостоятельно разработать уникальный статический веб-сайт, презентующий экосистему «Syllabica» и её ключевой сервис «Видеотекст». Ключевые требования к сайту:</w:t>
+        <w:t>В соответствии с заданием по дисциплине «Проектная деятельность» требовалось самостоятельно разработать уникальный статический веб-сайт, презентующий экосистему «</w:t>
+      </w:r>
+      <w:proofErr w:type="spellStart"/>
+      <w:r>
+        <w:rPr>
+          <w:rFonts w:ascii="Times New Roman" w:eastAsia="Times New Roman" w:hAnsi="Times New Roman" w:cs="Times New Roman"/>
+          <w:color w:val="000000"/>
+          <w:sz w:val="28"/>
+          <w:szCs w:val="28"/>
+        </w:rPr>
+        <w:t>Syllabica</w:t>
+      </w:r>
+      <w:proofErr w:type="spellEnd"/>
+      <w:r>
+        <w:rPr>
+          <w:rFonts w:ascii="Times New Roman" w:eastAsia="Times New Roman" w:hAnsi="Times New Roman" w:cs="Times New Roman"/>
+          <w:color w:val="000000"/>
+          <w:sz w:val="28"/>
+          <w:szCs w:val="28"/>
+        </w:rPr>
+        <w:t>» и её ключевой сервис «Видеотекст». Ключевые требования к сайту:</w:t>
       </w:r>
     </w:p>
     <w:p>
@@ -2228,38 +2426,16 @@
           <w:sz w:val="28"/>
           <w:szCs w:val="28"/>
         </w:rPr>
-        <w:t>Уникальность оформления и контента</w:t>
-      </w:r>
-      <w:proofErr w:type="gramStart"/>
-      <w:r>
-        <w:rPr>
-          <w:rFonts w:ascii="Times New Roman" w:eastAsia="Times New Roman" w:hAnsi="Times New Roman" w:cs="Times New Roman"/>
-          <w:b/>
-          <w:bCs/>
-          <w:color w:val="000000"/>
-          <w:sz w:val="28"/>
-          <w:szCs w:val="28"/>
-        </w:rPr>
-        <w:t>:</w:t>
-      </w:r>
-      <w:r>
-        <w:rPr>
-          <w:rFonts w:ascii="Times New Roman" w:eastAsia="Times New Roman" w:hAnsi="Times New Roman" w:cs="Times New Roman"/>
-          <w:color w:val="000000"/>
-          <w:sz w:val="28"/>
-          <w:szCs w:val="28"/>
-        </w:rPr>
-        <w:t> Обеспечить</w:t>
-      </w:r>
-      <w:proofErr w:type="gramEnd"/>
-      <w:r>
-        <w:rPr>
-          <w:rFonts w:ascii="Times New Roman" w:eastAsia="Times New Roman" w:hAnsi="Times New Roman" w:cs="Times New Roman"/>
-          <w:color w:val="000000"/>
-          <w:sz w:val="28"/>
-          <w:szCs w:val="28"/>
-        </w:rPr>
-        <w:t xml:space="preserve"> несовпадение с работами других студентов более чем на 50% (дизайн, стилистика, текстовое наполнение).</w:t>
+        <w:t>Уникальность оформления и контента:</w:t>
+      </w:r>
+      <w:r>
+        <w:rPr>
+          <w:rFonts w:ascii="Times New Roman" w:eastAsia="Times New Roman" w:hAnsi="Times New Roman" w:cs="Times New Roman"/>
+          <w:color w:val="000000"/>
+          <w:sz w:val="28"/>
+          <w:szCs w:val="28"/>
+        </w:rPr>
+        <w:t> Обеспечить несовпадение с работами других студентов более чем на 50% (дизайн, стилистика, текстовое наполнение).</w:t>
       </w:r>
     </w:p>
     <w:p>
@@ -2294,6 +2470,7 @@
           <w:sz w:val="28"/>
           <w:szCs w:val="28"/>
         </w:rPr>
+        <w:lastRenderedPageBreak/>
         <w:t>Обязательная структура сайта, включающая:</w:t>
       </w:r>
     </w:p>
@@ -2338,7 +2515,27 @@
           <w:sz w:val="28"/>
           <w:szCs w:val="28"/>
         </w:rPr>
-        <w:t> с аннотацией проекта (краткое описание сути «Видеотекста» и платформы «Syllabica»).</w:t>
+        <w:t> с аннотацией проекта (краткое описание сути «Видеотекста» и платформы «</w:t>
+      </w:r>
+      <w:proofErr w:type="spellStart"/>
+      <w:r>
+        <w:rPr>
+          <w:rFonts w:ascii="Times New Roman" w:eastAsia="Times New Roman" w:hAnsi="Times New Roman" w:cs="Times New Roman"/>
+          <w:color w:val="000000"/>
+          <w:sz w:val="28"/>
+          <w:szCs w:val="28"/>
+        </w:rPr>
+        <w:t>Syllabica</w:t>
+      </w:r>
+      <w:proofErr w:type="spellEnd"/>
+      <w:r>
+        <w:rPr>
+          <w:rFonts w:ascii="Times New Roman" w:eastAsia="Times New Roman" w:hAnsi="Times New Roman" w:cs="Times New Roman"/>
+          <w:color w:val="000000"/>
+          <w:sz w:val="28"/>
+          <w:szCs w:val="28"/>
+        </w:rPr>
+        <w:t>»).</w:t>
       </w:r>
     </w:p>
     <w:p>
@@ -2373,7 +2570,6 @@
           <w:sz w:val="28"/>
           <w:szCs w:val="28"/>
         </w:rPr>
-        <w:lastRenderedPageBreak/>
         <w:t>Страницу «О проекте»</w:t>
       </w:r>
       <w:r>
@@ -2515,27 +2711,27 @@
           <w:sz w:val="28"/>
           <w:szCs w:val="28"/>
         </w:rPr>
-        <w:t xml:space="preserve"> с подборкой внешних ссылок на организацию-партнёра (Лаборатория / Институт Пушкина), научные статьи </w:t>
-      </w:r>
-      <w:proofErr w:type="gramStart"/>
-      <w:r>
-        <w:rPr>
-          <w:rFonts w:ascii="Times New Roman" w:eastAsia="Times New Roman" w:hAnsi="Times New Roman" w:cs="Times New Roman"/>
-          <w:color w:val="000000"/>
-          <w:sz w:val="28"/>
-          <w:szCs w:val="28"/>
-        </w:rPr>
-        <w:t>Г.В.</w:t>
-      </w:r>
-      <w:proofErr w:type="gramEnd"/>
-      <w:r>
-        <w:rPr>
-          <w:rFonts w:ascii="Times New Roman" w:eastAsia="Times New Roman" w:hAnsi="Times New Roman" w:cs="Times New Roman"/>
-          <w:color w:val="000000"/>
-          <w:sz w:val="28"/>
-          <w:szCs w:val="28"/>
-        </w:rPr>
-        <w:t xml:space="preserve"> Векшина и иные полезные материалы, раскрывающие суть силлабоцентрического подхода.</w:t>
+        <w:t xml:space="preserve"> с подборкой внешних ссылок на организацию-партнёра (Лаборатория / Институт Пушкина), научные статьи Г.В. Векшина и иные полезные материалы, раскрывающие суть </w:t>
+      </w:r>
+      <w:proofErr w:type="spellStart"/>
+      <w:r>
+        <w:rPr>
+          <w:rFonts w:ascii="Times New Roman" w:eastAsia="Times New Roman" w:hAnsi="Times New Roman" w:cs="Times New Roman"/>
+          <w:color w:val="000000"/>
+          <w:sz w:val="28"/>
+          <w:szCs w:val="28"/>
+        </w:rPr>
+        <w:t>силлабоцентрического</w:t>
+      </w:r>
+      <w:proofErr w:type="spellEnd"/>
+      <w:r>
+        <w:rPr>
+          <w:rFonts w:ascii="Times New Roman" w:eastAsia="Times New Roman" w:hAnsi="Times New Roman" w:cs="Times New Roman"/>
+          <w:color w:val="000000"/>
+          <w:sz w:val="28"/>
+          <w:szCs w:val="28"/>
+        </w:rPr>
+        <w:t xml:space="preserve"> подхода.</w:t>
       </w:r>
     </w:p>
     <w:p>
@@ -2609,6 +2805,7 @@
         </w:rPr>
         <w:t>.</w:t>
       </w:r>
+      <w:proofErr w:type="spellStart"/>
       <w:r>
         <w:rPr>
           <w:rFonts w:ascii="Times New Roman" w:eastAsia="Times New Roman" w:hAnsi="Times New Roman" w:cs="Times New Roman"/>
@@ -2619,6 +2816,7 @@
         </w:rPr>
         <w:t>js</w:t>
       </w:r>
+      <w:proofErr w:type="spellEnd"/>
     </w:p>
     <w:p>
       <w:pPr>
@@ -2991,7 +3189,27 @@
           <w:sz w:val="28"/>
           <w:szCs w:val="28"/>
         </w:rPr>
-        <w:t> Выделены общие компоненты (меню навигации, карточки аналитики, панели инструментов), создана система CSS-переменных для унификации стилей, соответствующая визуальному стилю экосистемы Syllabus (динамическая подсветка, контрастные шрифтовые пары).</w:t>
+        <w:t xml:space="preserve"> Выделены общие компоненты (меню навигации, карточки аналитики, панели инструментов), создана система CSS-переменных для унификации стилей, соответствующая визуальному стилю экосистемы </w:t>
+      </w:r>
+      <w:proofErr w:type="spellStart"/>
+      <w:r>
+        <w:rPr>
+          <w:rFonts w:ascii="Times New Roman" w:eastAsia="Times New Roman" w:hAnsi="Times New Roman" w:cs="Times New Roman"/>
+          <w:color w:val="000000"/>
+          <w:sz w:val="28"/>
+          <w:szCs w:val="28"/>
+        </w:rPr>
+        <w:t>Syllabus</w:t>
+      </w:r>
+      <w:proofErr w:type="spellEnd"/>
+      <w:r>
+        <w:rPr>
+          <w:rFonts w:ascii="Times New Roman" w:eastAsia="Times New Roman" w:hAnsi="Times New Roman" w:cs="Times New Roman"/>
+          <w:color w:val="000000"/>
+          <w:sz w:val="28"/>
+          <w:szCs w:val="28"/>
+        </w:rPr>
+        <w:t xml:space="preserve"> (динамическая подсветка, контрастные шрифтовые пары).</w:t>
       </w:r>
     </w:p>
     <w:p>
@@ -3035,7 +3253,27 @@
           <w:sz w:val="28"/>
           <w:szCs w:val="28"/>
         </w:rPr>
-        <w:t> Реализована гибкая система сеток с использованием медиазапросов, обеспечивающая комфортное чтение «генетической информации» как на широкоформатных мониторах, так и на экранах планшетов.</w:t>
+        <w:t xml:space="preserve"> Реализована гибкая система сеток с использованием </w:t>
+      </w:r>
+      <w:proofErr w:type="spellStart"/>
+      <w:r>
+        <w:rPr>
+          <w:rFonts w:ascii="Times New Roman" w:eastAsia="Times New Roman" w:hAnsi="Times New Roman" w:cs="Times New Roman"/>
+          <w:color w:val="000000"/>
+          <w:sz w:val="28"/>
+          <w:szCs w:val="28"/>
+        </w:rPr>
+        <w:t>медиазапросов</w:t>
+      </w:r>
+      <w:proofErr w:type="spellEnd"/>
+      <w:r>
+        <w:rPr>
+          <w:rFonts w:ascii="Times New Roman" w:eastAsia="Times New Roman" w:hAnsi="Times New Roman" w:cs="Times New Roman"/>
+          <w:color w:val="000000"/>
+          <w:sz w:val="28"/>
+          <w:szCs w:val="28"/>
+        </w:rPr>
+        <w:t>, обеспечивающая комфортное чтение «генетической информации» как на широкоформатных мониторах, так и на экранах планшетов.</w:t>
       </w:r>
     </w:p>
     <w:p>
@@ -3079,7 +3317,27 @@
           <w:sz w:val="28"/>
           <w:szCs w:val="28"/>
         </w:rPr>
-        <w:t> Сверстанные блоки промаркированы и подготовлены для внедрения «видеотипографики» (морфинга символов, мерцания удаляемого текста и пословной анимации), что полностью соответствует концепции проекта.</w:t>
+        <w:t> Сверстанные блоки промаркированы и подготовлены для внедрения «</w:t>
+      </w:r>
+      <w:proofErr w:type="spellStart"/>
+      <w:r>
+        <w:rPr>
+          <w:rFonts w:ascii="Times New Roman" w:eastAsia="Times New Roman" w:hAnsi="Times New Roman" w:cs="Times New Roman"/>
+          <w:color w:val="000000"/>
+          <w:sz w:val="28"/>
+          <w:szCs w:val="28"/>
+        </w:rPr>
+        <w:t>видеотипографики</w:t>
+      </w:r>
+      <w:proofErr w:type="spellEnd"/>
+      <w:r>
+        <w:rPr>
+          <w:rFonts w:ascii="Times New Roman" w:eastAsia="Times New Roman" w:hAnsi="Times New Roman" w:cs="Times New Roman"/>
+          <w:color w:val="000000"/>
+          <w:sz w:val="28"/>
+          <w:szCs w:val="28"/>
+        </w:rPr>
+        <w:t>» (морфинга символов, мерцания удаляемого текста и пословной анимации), что полностью соответствует концепции проекта.</w:t>
       </w:r>
     </w:p>
     <w:p>
@@ -3123,7 +3381,27 @@
           <w:sz w:val="28"/>
           <w:szCs w:val="28"/>
         </w:rPr>
-        <w:t> Проверена работоспособность верстки в актуальных версиях браузеров (Chrome, Firefox, Safari).</w:t>
+        <w:t> Проверена работоспособность верстки в актуальных версиях браузеров (</w:t>
+      </w:r>
+      <w:proofErr w:type="spellStart"/>
+      <w:r>
+        <w:rPr>
+          <w:rFonts w:ascii="Times New Roman" w:eastAsia="Times New Roman" w:hAnsi="Times New Roman" w:cs="Times New Roman"/>
+          <w:color w:val="000000"/>
+          <w:sz w:val="28"/>
+          <w:szCs w:val="28"/>
+        </w:rPr>
+        <w:t>Chrome</w:t>
+      </w:r>
+      <w:proofErr w:type="spellEnd"/>
+      <w:r>
+        <w:rPr>
+          <w:rFonts w:ascii="Times New Roman" w:eastAsia="Times New Roman" w:hAnsi="Times New Roman" w:cs="Times New Roman"/>
+          <w:color w:val="000000"/>
+          <w:sz w:val="28"/>
+          <w:szCs w:val="28"/>
+        </w:rPr>
+        <w:t>, Firefox, Safari).</w:t>
       </w:r>
     </w:p>
     <w:p>
@@ -3156,7 +3434,27 @@
           <w:sz w:val="28"/>
           <w:szCs w:val="28"/>
         </w:rPr>
-        <w:t>Верстка полностью готова к передаче на backend-разработку и наполнению реальной текстологической информацией.</w:t>
+        <w:t xml:space="preserve">Верстка полностью готова к передаче на </w:t>
+      </w:r>
+      <w:proofErr w:type="spellStart"/>
+      <w:r>
+        <w:rPr>
+          <w:rFonts w:ascii="Times New Roman" w:eastAsia="Times New Roman" w:hAnsi="Times New Roman" w:cs="Times New Roman"/>
+          <w:color w:val="000000"/>
+          <w:sz w:val="28"/>
+          <w:szCs w:val="28"/>
+        </w:rPr>
+        <w:t>backend</w:t>
+      </w:r>
+      <w:proofErr w:type="spellEnd"/>
+      <w:r>
+        <w:rPr>
+          <w:rFonts w:ascii="Times New Roman" w:eastAsia="Times New Roman" w:hAnsi="Times New Roman" w:cs="Times New Roman"/>
+          <w:color w:val="000000"/>
+          <w:sz w:val="28"/>
+          <w:szCs w:val="28"/>
+        </w:rPr>
+        <w:t>-разработку и наполнению реальной текстологической информацией.</w:t>
       </w:r>
     </w:p>
     <w:p>
@@ -3197,7 +3495,27 @@
           <w:szCs w:val="28"/>
         </w:rPr>
         <w:br/>
-        <w:t>Разработан и свёрстан полноценный статический веб-сайт, представляющий проект «Видеотекст» и экосистему «Syllabica». Сайт характеризуется уникальным визуальным стилем, разработанным специально для данной задачи. Достигнуто полное покрытие требований:</w:t>
+        <w:t>Разработан и свёрстан полноценный статический веб-сайт, представляющий проект «Видеотекст» и экосистему «</w:t>
+      </w:r>
+      <w:proofErr w:type="spellStart"/>
+      <w:r>
+        <w:rPr>
+          <w:rFonts w:ascii="Times New Roman" w:eastAsia="Times New Roman" w:hAnsi="Times New Roman" w:cs="Times New Roman"/>
+          <w:color w:val="000000"/>
+          <w:sz w:val="28"/>
+          <w:szCs w:val="28"/>
+        </w:rPr>
+        <w:t>Syllabica</w:t>
+      </w:r>
+      <w:proofErr w:type="spellEnd"/>
+      <w:r>
+        <w:rPr>
+          <w:rFonts w:ascii="Times New Roman" w:eastAsia="Times New Roman" w:hAnsi="Times New Roman" w:cs="Times New Roman"/>
+          <w:color w:val="000000"/>
+          <w:sz w:val="28"/>
+          <w:szCs w:val="28"/>
+        </w:rPr>
+        <w:t>». Сайт характеризуется уникальным визуальным стилем, разработанным специально для данной задачи. Достигнуто полное покрытие требований:</w:t>
       </w:r>
     </w:p>
     <w:p>
@@ -3378,7 +3696,47 @@
           <w:sz w:val="28"/>
           <w:szCs w:val="28"/>
         </w:rPr>
-        <w:t>Подробно изложено описание экосистемы «Syllabica», сервиса «Видеотекст» и силлабоцентрической концепции. Текст адаптирован для широкой аудитории, но сохраняет научную достоверность. Акцент сделан на актуальности визуализации правки для образования и копирайтинга.</w:t>
+        <w:t>Подробно изложено описание экосистемы «</w:t>
+      </w:r>
+      <w:proofErr w:type="spellStart"/>
+      <w:r>
+        <w:rPr>
+          <w:rFonts w:ascii="Times New Roman" w:eastAsia="Times New Roman" w:hAnsi="Times New Roman" w:cs="Times New Roman"/>
+          <w:color w:val="000000"/>
+          <w:sz w:val="28"/>
+          <w:szCs w:val="28"/>
+        </w:rPr>
+        <w:t>Syllabica</w:t>
+      </w:r>
+      <w:proofErr w:type="spellEnd"/>
+      <w:r>
+        <w:rPr>
+          <w:rFonts w:ascii="Times New Roman" w:eastAsia="Times New Roman" w:hAnsi="Times New Roman" w:cs="Times New Roman"/>
+          <w:color w:val="000000"/>
+          <w:sz w:val="28"/>
+          <w:szCs w:val="28"/>
+        </w:rPr>
+        <w:t xml:space="preserve">», сервиса «Видеотекст» и </w:t>
+      </w:r>
+      <w:proofErr w:type="spellStart"/>
+      <w:r>
+        <w:rPr>
+          <w:rFonts w:ascii="Times New Roman" w:eastAsia="Times New Roman" w:hAnsi="Times New Roman" w:cs="Times New Roman"/>
+          <w:color w:val="000000"/>
+          <w:sz w:val="28"/>
+          <w:szCs w:val="28"/>
+        </w:rPr>
+        <w:t>силлабоцентрической</w:t>
+      </w:r>
+      <w:proofErr w:type="spellEnd"/>
+      <w:r>
+        <w:rPr>
+          <w:rFonts w:ascii="Times New Roman" w:eastAsia="Times New Roman" w:hAnsi="Times New Roman" w:cs="Times New Roman"/>
+          <w:color w:val="000000"/>
+          <w:sz w:val="28"/>
+          <w:szCs w:val="28"/>
+        </w:rPr>
+        <w:t xml:space="preserve"> концепции. Текст адаптирован для широкой аудитории, но сохраняет научную достоверность. Акцент сделан на актуальности визуализации правки для образования и копирайтинга.</w:t>
       </w:r>
     </w:p>
     <w:p>
@@ -3446,27 +3804,27 @@
           <w:sz w:val="28"/>
           <w:szCs w:val="28"/>
         </w:rPr>
-        <w:t xml:space="preserve">Созданы карточки участников проектной группы. Для каждого студента (включая указание личного вклада автора отчёта) прописана роль в проекте по дисциплине «Проектная деятельность». Например: «Иванов </w:t>
-      </w:r>
-      <w:proofErr w:type="gramStart"/>
-      <w:r>
-        <w:rPr>
-          <w:rFonts w:ascii="Times New Roman" w:eastAsia="Times New Roman" w:hAnsi="Times New Roman" w:cs="Times New Roman"/>
-          <w:color w:val="000000"/>
-          <w:sz w:val="28"/>
-          <w:szCs w:val="28"/>
-        </w:rPr>
-        <w:t>И.И.</w:t>
-      </w:r>
-      <w:proofErr w:type="gramEnd"/>
-      <w:r>
-        <w:rPr>
-          <w:rFonts w:ascii="Times New Roman" w:eastAsia="Times New Roman" w:hAnsi="Times New Roman" w:cs="Times New Roman"/>
-          <w:color w:val="000000"/>
-          <w:sz w:val="28"/>
-          <w:szCs w:val="28"/>
-        </w:rPr>
-        <w:t xml:space="preserve"> — Frontend-разработчик, выполнил верстку макетов страниц генетического сценария и досье, осуществил сборку статического сайта-презентации». Сведения уникальны для группы.</w:t>
+        <w:t xml:space="preserve">Созданы карточки участников проектной группы. Для каждого студента (включая указание личного вклада автора отчёта) прописана роль в проекте по дисциплине «Проектная деятельность». Например: «Иванов И.И. — </w:t>
+      </w:r>
+      <w:proofErr w:type="spellStart"/>
+      <w:r>
+        <w:rPr>
+          <w:rFonts w:ascii="Times New Roman" w:eastAsia="Times New Roman" w:hAnsi="Times New Roman" w:cs="Times New Roman"/>
+          <w:color w:val="000000"/>
+          <w:sz w:val="28"/>
+          <w:szCs w:val="28"/>
+        </w:rPr>
+        <w:t>Frontend</w:t>
+      </w:r>
+      <w:proofErr w:type="spellEnd"/>
+      <w:r>
+        <w:rPr>
+          <w:rFonts w:ascii="Times New Roman" w:eastAsia="Times New Roman" w:hAnsi="Times New Roman" w:cs="Times New Roman"/>
+          <w:color w:val="000000"/>
+          <w:sz w:val="28"/>
+          <w:szCs w:val="28"/>
+        </w:rPr>
+        <w:t>-разработчик, выполнил верстку макетов страниц генетического сценария и досье, осуществил сборку статического сайта-презентации». Сведения уникальны для группы.</w:t>
       </w:r>
     </w:p>
     <w:p>
@@ -3569,36 +3927,40 @@
           <w:sz w:val="28"/>
           <w:szCs w:val="28"/>
         </w:rPr>
-        <w:t>«Старт проекта: изучение концепции Syllabica»</w:t>
-      </w:r>
-      <w:r>
-        <w:rPr>
-          <w:rFonts w:ascii="Times New Roman" w:eastAsia="Times New Roman" w:hAnsi="Times New Roman" w:cs="Times New Roman"/>
-          <w:color w:val="000000"/>
-          <w:sz w:val="28"/>
-          <w:szCs w:val="28"/>
-        </w:rPr>
-        <w:t xml:space="preserve"> (описано знакомство с научной базой </w:t>
-      </w:r>
-      <w:proofErr w:type="gramStart"/>
-      <w:r>
-        <w:rPr>
-          <w:rFonts w:ascii="Times New Roman" w:eastAsia="Times New Roman" w:hAnsi="Times New Roman" w:cs="Times New Roman"/>
-          <w:color w:val="000000"/>
-          <w:sz w:val="28"/>
-          <w:szCs w:val="28"/>
-        </w:rPr>
-        <w:t>Г.В.</w:t>
-      </w:r>
-      <w:proofErr w:type="gramEnd"/>
-      <w:r>
-        <w:rPr>
-          <w:rFonts w:ascii="Times New Roman" w:eastAsia="Times New Roman" w:hAnsi="Times New Roman" w:cs="Times New Roman"/>
-          <w:color w:val="000000"/>
-          <w:sz w:val="28"/>
-          <w:szCs w:val="28"/>
-        </w:rPr>
-        <w:t xml:space="preserve"> Векшина).</w:t>
+        <w:t xml:space="preserve">«Старт проекта: изучение концепции </w:t>
+      </w:r>
+      <w:proofErr w:type="spellStart"/>
+      <w:r>
+        <w:rPr>
+          <w:rFonts w:ascii="Times New Roman" w:eastAsia="Times New Roman" w:hAnsi="Times New Roman" w:cs="Times New Roman"/>
+          <w:i/>
+          <w:iCs/>
+          <w:color w:val="000000"/>
+          <w:sz w:val="28"/>
+          <w:szCs w:val="28"/>
+        </w:rPr>
+        <w:t>Syllabica</w:t>
+      </w:r>
+      <w:proofErr w:type="spellEnd"/>
+      <w:r>
+        <w:rPr>
+          <w:rFonts w:ascii="Times New Roman" w:eastAsia="Times New Roman" w:hAnsi="Times New Roman" w:cs="Times New Roman"/>
+          <w:i/>
+          <w:iCs/>
+          <w:color w:val="000000"/>
+          <w:sz w:val="28"/>
+          <w:szCs w:val="28"/>
+        </w:rPr>
+        <w:t>»</w:t>
+      </w:r>
+      <w:r>
+        <w:rPr>
+          <w:rFonts w:ascii="Times New Roman" w:eastAsia="Times New Roman" w:hAnsi="Times New Roman" w:cs="Times New Roman"/>
+          <w:color w:val="000000"/>
+          <w:sz w:val="28"/>
+          <w:szCs w:val="28"/>
+        </w:rPr>
+        <w:t> (описано знакомство с научной базой Г.В. Векшина).</w:t>
       </w:r>
     </w:p>
     <w:p>
@@ -3633,41 +3995,9 @@
           <w:sz w:val="28"/>
           <w:szCs w:val="28"/>
         </w:rPr>
-        <w:t>«Работа с макетами: от Figma к коду»</w:t>
-      </w:r>
-      <w:r>
-        <w:rPr>
-          <w:rFonts w:ascii="Times New Roman" w:eastAsia="Times New Roman" w:hAnsi="Times New Roman" w:cs="Times New Roman"/>
-          <w:color w:val="000000"/>
-          <w:sz w:val="28"/>
-          <w:szCs w:val="28"/>
-        </w:rPr>
-        <w:t> (описан прогресс переноса дизайна в HTML/CSS).</w:t>
-      </w:r>
-    </w:p>
-    <w:p>
-      <w:pPr>
-        <w:keepNext/>
-        <w:keepLines/>
-        <w:numPr>
-          <w:ilvl w:val="2"/>
-          <w:numId w:val="31"/>
-        </w:numPr>
-        <w:pBdr>
-          <w:top w:val="nil"/>
-          <w:left w:val="nil"/>
-          <w:bottom w:val="nil"/>
-          <w:right w:val="nil"/>
-          <w:between w:val="nil"/>
-        </w:pBdr>
-        <w:spacing w:after="0" w:line="360" w:lineRule="auto"/>
-        <w:rPr>
-          <w:rFonts w:ascii="Times New Roman" w:eastAsia="Times New Roman" w:hAnsi="Times New Roman" w:cs="Times New Roman"/>
-          <w:color w:val="000000"/>
-          <w:sz w:val="28"/>
-          <w:szCs w:val="28"/>
-        </w:rPr>
-      </w:pPr>
+        <w:t xml:space="preserve">«Работа с макетами: от </w:t>
+      </w:r>
+      <w:proofErr w:type="spellStart"/>
       <w:r>
         <w:rPr>
           <w:rFonts w:ascii="Times New Roman" w:eastAsia="Times New Roman" w:hAnsi="Times New Roman" w:cs="Times New Roman"/>
@@ -3677,16 +4007,28 @@
           <w:sz w:val="28"/>
           <w:szCs w:val="28"/>
         </w:rPr>
-        <w:t>«Сборка презентационного сайта и подготовка к защите»</w:t>
-      </w:r>
-      <w:r>
-        <w:rPr>
-          <w:rFonts w:ascii="Times New Roman" w:eastAsia="Times New Roman" w:hAnsi="Times New Roman" w:cs="Times New Roman"/>
-          <w:color w:val="000000"/>
-          <w:sz w:val="28"/>
-          <w:szCs w:val="28"/>
-        </w:rPr>
-        <w:t> (описан финальный этап компоновки контента).</w:t>
+        <w:t>Figma</w:t>
+      </w:r>
+      <w:proofErr w:type="spellEnd"/>
+      <w:r>
+        <w:rPr>
+          <w:rFonts w:ascii="Times New Roman" w:eastAsia="Times New Roman" w:hAnsi="Times New Roman" w:cs="Times New Roman"/>
+          <w:i/>
+          <w:iCs/>
+          <w:color w:val="000000"/>
+          <w:sz w:val="28"/>
+          <w:szCs w:val="28"/>
+        </w:rPr>
+        <w:t xml:space="preserve"> к коду»</w:t>
+      </w:r>
+      <w:r>
+        <w:rPr>
+          <w:rFonts w:ascii="Times New Roman" w:eastAsia="Times New Roman" w:hAnsi="Times New Roman" w:cs="Times New Roman"/>
+          <w:color w:val="000000"/>
+          <w:sz w:val="28"/>
+          <w:szCs w:val="28"/>
+        </w:rPr>
+        <w:t> (описан прогресс переноса дизайна в HTML/CSS).</w:t>
       </w:r>
     </w:p>
     <w:p>
@@ -3787,7 +4129,27 @@
           <w:sz w:val="28"/>
           <w:szCs w:val="28"/>
         </w:rPr>
-        <w:t>Ссылку на сайт Лаборатории цифровой фоностилистики (партнёр);</w:t>
+        <w:t xml:space="preserve">Ссылку на сайт Лаборатории цифровой </w:t>
+      </w:r>
+      <w:proofErr w:type="spellStart"/>
+      <w:r>
+        <w:rPr>
+          <w:rFonts w:ascii="Times New Roman" w:eastAsia="Times New Roman" w:hAnsi="Times New Roman" w:cs="Times New Roman"/>
+          <w:color w:val="000000"/>
+          <w:sz w:val="28"/>
+          <w:szCs w:val="28"/>
+        </w:rPr>
+        <w:t>фоностилистики</w:t>
+      </w:r>
+      <w:proofErr w:type="spellEnd"/>
+      <w:r>
+        <w:rPr>
+          <w:rFonts w:ascii="Times New Roman" w:eastAsia="Times New Roman" w:hAnsi="Times New Roman" w:cs="Times New Roman"/>
+          <w:color w:val="000000"/>
+          <w:sz w:val="28"/>
+          <w:szCs w:val="28"/>
+        </w:rPr>
+        <w:t xml:space="preserve"> (партнёр);</w:t>
       </w:r>
     </w:p>
     <w:p>
@@ -3820,27 +4182,27 @@
           <w:sz w:val="28"/>
           <w:szCs w:val="28"/>
         </w:rPr>
-        <w:t xml:space="preserve">Прямые ссылки на ключевые научные статьи и доклады </w:t>
-      </w:r>
-      <w:proofErr w:type="gramStart"/>
-      <w:r>
-        <w:rPr>
-          <w:rFonts w:ascii="Times New Roman" w:eastAsia="Times New Roman" w:hAnsi="Times New Roman" w:cs="Times New Roman"/>
-          <w:color w:val="000000"/>
-          <w:sz w:val="28"/>
-          <w:szCs w:val="28"/>
-        </w:rPr>
-        <w:t>Г.В.</w:t>
-      </w:r>
-      <w:proofErr w:type="gramEnd"/>
-      <w:r>
-        <w:rPr>
-          <w:rFonts w:ascii="Times New Roman" w:eastAsia="Times New Roman" w:hAnsi="Times New Roman" w:cs="Times New Roman"/>
-          <w:color w:val="000000"/>
-          <w:sz w:val="28"/>
-          <w:szCs w:val="28"/>
-        </w:rPr>
-        <w:t xml:space="preserve"> Векшина по фоносиллабеме;</w:t>
+        <w:t xml:space="preserve">Прямые ссылки на ключевые научные статьи и доклады Г.В. Векшина по </w:t>
+      </w:r>
+      <w:proofErr w:type="spellStart"/>
+      <w:r>
+        <w:rPr>
+          <w:rFonts w:ascii="Times New Roman" w:eastAsia="Times New Roman" w:hAnsi="Times New Roman" w:cs="Times New Roman"/>
+          <w:color w:val="000000"/>
+          <w:sz w:val="28"/>
+          <w:szCs w:val="28"/>
+        </w:rPr>
+        <w:t>фоносиллабеме</w:t>
+      </w:r>
+      <w:proofErr w:type="spellEnd"/>
+      <w:r>
+        <w:rPr>
+          <w:rFonts w:ascii="Times New Roman" w:eastAsia="Times New Roman" w:hAnsi="Times New Roman" w:cs="Times New Roman"/>
+          <w:color w:val="000000"/>
+          <w:sz w:val="28"/>
+          <w:szCs w:val="28"/>
+        </w:rPr>
+        <w:t>;</w:t>
       </w:r>
     </w:p>
     <w:p>
@@ -3873,7 +4235,27 @@
           <w:sz w:val="28"/>
           <w:szCs w:val="28"/>
         </w:rPr>
-        <w:t>Ссылки на внешние ресурсы по теме Digital Humanities и TEI-разметке.</w:t>
+        <w:t xml:space="preserve">Ссылки на внешние ресурсы по теме Digital </w:t>
+      </w:r>
+      <w:proofErr w:type="spellStart"/>
+      <w:r>
+        <w:rPr>
+          <w:rFonts w:ascii="Times New Roman" w:eastAsia="Times New Roman" w:hAnsi="Times New Roman" w:cs="Times New Roman"/>
+          <w:color w:val="000000"/>
+          <w:sz w:val="28"/>
+          <w:szCs w:val="28"/>
+        </w:rPr>
+        <w:t>Humanities</w:t>
+      </w:r>
+      <w:proofErr w:type="spellEnd"/>
+      <w:r>
+        <w:rPr>
+          <w:rFonts w:ascii="Times New Roman" w:eastAsia="Times New Roman" w:hAnsi="Times New Roman" w:cs="Times New Roman"/>
+          <w:color w:val="000000"/>
+          <w:sz w:val="28"/>
+          <w:szCs w:val="28"/>
+        </w:rPr>
+        <w:t xml:space="preserve"> и TEI-разметке.</w:t>
       </w:r>
     </w:p>
     <w:p>
@@ -3906,7 +4288,6 @@
           <w:sz w:val="28"/>
           <w:szCs w:val="28"/>
         </w:rPr>
-        <w:lastRenderedPageBreak/>
         <w:t>Все ссылки рабочие, открываются в новой вкладке и снабжены краткими аннотациями на русском языке.</w:t>
       </w:r>
     </w:p>
@@ -3935,9 +4316,10 @@
           <w:b/>
           <w:bCs/>
           <w:color w:val="000000"/>
-          <w:sz w:val="28"/>
-          <w:szCs w:val="28"/>
-        </w:rPr>
+          <w:sz w:val="32"/>
+          <w:szCs w:val="32"/>
+        </w:rPr>
+        <w:lastRenderedPageBreak/>
         <w:t>ЗАКЛЮЧЕНИЕ</w:t>
       </w:r>
     </w:p>
@@ -4025,8 +4407,8 @@
         <w:rPr>
           <w:rFonts w:ascii="Times New Roman" w:eastAsia="Times New Roman" w:hAnsi="Times New Roman" w:cs="Times New Roman"/>
           <w:color w:val="000000"/>
-          <w:sz w:val="28"/>
-          <w:szCs w:val="28"/>
+          <w:sz w:val="32"/>
+          <w:szCs w:val="32"/>
         </w:rPr>
       </w:pPr>
       <w:r>
@@ -4035,8 +4417,8 @@
           <w:b/>
           <w:bCs/>
           <w:color w:val="000000"/>
-          <w:sz w:val="28"/>
-          <w:szCs w:val="28"/>
+          <w:sz w:val="32"/>
+          <w:szCs w:val="32"/>
         </w:rPr>
         <w:t>СПИСОК ИСПОЛЬЗОВАННОЙ ЛИТЕРАТУРЫ</w:t>
       </w:r>
@@ -4071,27 +4453,27 @@
           <w:sz w:val="28"/>
           <w:szCs w:val="28"/>
         </w:rPr>
-        <w:t xml:space="preserve">Векшин </w:t>
-      </w:r>
-      <w:proofErr w:type="gramStart"/>
-      <w:r>
-        <w:rPr>
-          <w:rFonts w:ascii="Times New Roman" w:eastAsia="Times New Roman" w:hAnsi="Times New Roman" w:cs="Times New Roman"/>
-          <w:color w:val="000000"/>
-          <w:sz w:val="28"/>
-          <w:szCs w:val="28"/>
-        </w:rPr>
-        <w:t>Г.В.</w:t>
-      </w:r>
-      <w:proofErr w:type="gramEnd"/>
-      <w:r>
-        <w:rPr>
-          <w:rFonts w:ascii="Times New Roman" w:eastAsia="Times New Roman" w:hAnsi="Times New Roman" w:cs="Times New Roman"/>
-          <w:color w:val="000000"/>
-          <w:sz w:val="28"/>
-          <w:szCs w:val="28"/>
-        </w:rPr>
-        <w:t xml:space="preserve"> Фоносиллабема как единица звуковой организации текста // Вестник Московского университета. Серия 9: Филология. — Доступ из научной базы МГУ.</w:t>
+        <w:t xml:space="preserve">Векшин Г.В. </w:t>
+      </w:r>
+      <w:proofErr w:type="spellStart"/>
+      <w:r>
+        <w:rPr>
+          <w:rFonts w:ascii="Times New Roman" w:eastAsia="Times New Roman" w:hAnsi="Times New Roman" w:cs="Times New Roman"/>
+          <w:color w:val="000000"/>
+          <w:sz w:val="28"/>
+          <w:szCs w:val="28"/>
+        </w:rPr>
+        <w:t>Фоносиллабема</w:t>
+      </w:r>
+      <w:proofErr w:type="spellEnd"/>
+      <w:r>
+        <w:rPr>
+          <w:rFonts w:ascii="Times New Roman" w:eastAsia="Times New Roman" w:hAnsi="Times New Roman" w:cs="Times New Roman"/>
+          <w:color w:val="000000"/>
+          <w:sz w:val="28"/>
+          <w:szCs w:val="28"/>
+        </w:rPr>
+        <w:t xml:space="preserve"> как единица звуковой организации текста // Вестник Московского университета. Серия 9: Филология. — Доступ из научной базы МГУ.</w:t>
       </w:r>
     </w:p>
     <w:p>
@@ -4124,7 +4506,67 @@
           <w:sz w:val="28"/>
           <w:szCs w:val="28"/>
         </w:rPr>
-        <w:t>Экосистема цифровых текстовых исследований «Syllabica»: Концепция проектов «Фонотекст» и «Видеотекст» (Техническое описание и научное обоснование) / Лаборатория цифровой фоностилистики. — М.: Московский политех, 2024.</w:t>
+        <w:t>Экосистема цифровых текстовых исследований «</w:t>
+      </w:r>
+      <w:proofErr w:type="spellStart"/>
+      <w:r>
+        <w:rPr>
+          <w:rFonts w:ascii="Times New Roman" w:eastAsia="Times New Roman" w:hAnsi="Times New Roman" w:cs="Times New Roman"/>
+          <w:color w:val="000000"/>
+          <w:sz w:val="28"/>
+          <w:szCs w:val="28"/>
+        </w:rPr>
+        <w:t>Syllabica</w:t>
+      </w:r>
+      <w:proofErr w:type="spellEnd"/>
+      <w:r>
+        <w:rPr>
+          <w:rFonts w:ascii="Times New Roman" w:eastAsia="Times New Roman" w:hAnsi="Times New Roman" w:cs="Times New Roman"/>
+          <w:color w:val="000000"/>
+          <w:sz w:val="28"/>
+          <w:szCs w:val="28"/>
+        </w:rPr>
+        <w:t>»: Концепция проектов «</w:t>
+      </w:r>
+      <w:proofErr w:type="spellStart"/>
+      <w:r>
+        <w:rPr>
+          <w:rFonts w:ascii="Times New Roman" w:eastAsia="Times New Roman" w:hAnsi="Times New Roman" w:cs="Times New Roman"/>
+          <w:color w:val="000000"/>
+          <w:sz w:val="28"/>
+          <w:szCs w:val="28"/>
+        </w:rPr>
+        <w:t>Фонотекст</w:t>
+      </w:r>
+      <w:proofErr w:type="spellEnd"/>
+      <w:r>
+        <w:rPr>
+          <w:rFonts w:ascii="Times New Roman" w:eastAsia="Times New Roman" w:hAnsi="Times New Roman" w:cs="Times New Roman"/>
+          <w:color w:val="000000"/>
+          <w:sz w:val="28"/>
+          <w:szCs w:val="28"/>
+        </w:rPr>
+        <w:t xml:space="preserve">» и «Видеотекст» (Техническое описание и научное обоснование) / Лаборатория цифровой </w:t>
+      </w:r>
+      <w:proofErr w:type="spellStart"/>
+      <w:r>
+        <w:rPr>
+          <w:rFonts w:ascii="Times New Roman" w:eastAsia="Times New Roman" w:hAnsi="Times New Roman" w:cs="Times New Roman"/>
+          <w:color w:val="000000"/>
+          <w:sz w:val="28"/>
+          <w:szCs w:val="28"/>
+        </w:rPr>
+        <w:t>фоностилистики</w:t>
+      </w:r>
+      <w:proofErr w:type="spellEnd"/>
+      <w:r>
+        <w:rPr>
+          <w:rFonts w:ascii="Times New Roman" w:eastAsia="Times New Roman" w:hAnsi="Times New Roman" w:cs="Times New Roman"/>
+          <w:color w:val="000000"/>
+          <w:sz w:val="28"/>
+          <w:szCs w:val="28"/>
+        </w:rPr>
+        <w:t>. — М.: Московский политех, 2024.</w:t>
       </w:r>
     </w:p>
     <w:p>
@@ -4361,26 +4803,24 @@
         <w:spacing w:after="0" w:line="360" w:lineRule="auto"/>
         <w:rPr>
           <w:rFonts w:ascii="Times New Roman" w:eastAsia="Times New Roman" w:hAnsi="Times New Roman" w:cs="Times New Roman"/>
+          <w:color w:val="000000"/>
+          <w:sz w:val="28"/>
+          <w:szCs w:val="28"/>
+        </w:rPr>
+      </w:pPr>
+      <w:r>
+        <w:rPr>
+          <w:rFonts w:ascii="Times New Roman" w:eastAsia="Times New Roman" w:hAnsi="Times New Roman" w:cs="Times New Roman"/>
           <w:b/>
           <w:bCs/>
           <w:color w:val="000000"/>
-          <w:sz w:val="28"/>
-          <w:szCs w:val="28"/>
-        </w:rPr>
-      </w:pPr>
-    </w:p>
-    <w:p>
-      <w:pPr>
-        <w:keepNext/>
-        <w:keepLines/>
-        <w:pBdr>
-          <w:top w:val="nil"/>
-          <w:left w:val="nil"/>
-          <w:bottom w:val="nil"/>
-          <w:right w:val="nil"/>
-          <w:between w:val="nil"/>
-        </w:pBdr>
-        <w:spacing w:after="0" w:line="360" w:lineRule="auto"/>
+          <w:sz w:val="32"/>
+          <w:szCs w:val="32"/>
+        </w:rPr>
+        <w:lastRenderedPageBreak/>
+        <w:t>ПРИЛОЖЕНИЯ</w:t>
+      </w:r>
+      <w:r>
         <w:rPr>
           <w:rFonts w:ascii="Times New Roman" w:eastAsia="Times New Roman" w:hAnsi="Times New Roman" w:cs="Times New Roman"/>
           <w:b/>
@@ -4389,20 +4829,9 @@
           <w:sz w:val="28"/>
           <w:szCs w:val="28"/>
         </w:rPr>
-      </w:pPr>
-    </w:p>
-    <w:p>
-      <w:pPr>
-        <w:keepNext/>
-        <w:keepLines/>
-        <w:pBdr>
-          <w:top w:val="nil"/>
-          <w:left w:val="nil"/>
-          <w:bottom w:val="nil"/>
-          <w:right w:val="nil"/>
-          <w:between w:val="nil"/>
-        </w:pBdr>
-        <w:spacing w:after="0" w:line="360" w:lineRule="auto"/>
+        <w:br/>
+      </w:r>
+      <w:r>
         <w:rPr>
           <w:rFonts w:ascii="Times New Roman" w:eastAsia="Times New Roman" w:hAnsi="Times New Roman" w:cs="Times New Roman"/>
           <w:b/>
@@ -4411,20 +4840,9 @@
           <w:sz w:val="28"/>
           <w:szCs w:val="28"/>
         </w:rPr>
-      </w:pPr>
-    </w:p>
-    <w:p>
-      <w:pPr>
-        <w:keepNext/>
-        <w:keepLines/>
-        <w:pBdr>
-          <w:top w:val="nil"/>
-          <w:left w:val="nil"/>
-          <w:bottom w:val="nil"/>
-          <w:right w:val="nil"/>
-          <w:between w:val="nil"/>
-        </w:pBdr>
-        <w:spacing w:after="0" w:line="360" w:lineRule="auto"/>
+        <w:t>Ссылк</w:t>
+      </w:r>
+      <w:r>
         <w:rPr>
           <w:rFonts w:ascii="Times New Roman" w:eastAsia="Times New Roman" w:hAnsi="Times New Roman" w:cs="Times New Roman"/>
           <w:b/>
@@ -4433,20 +4851,9 @@
           <w:sz w:val="28"/>
           <w:szCs w:val="28"/>
         </w:rPr>
-      </w:pPr>
-    </w:p>
-    <w:p>
-      <w:pPr>
-        <w:keepNext/>
-        <w:keepLines/>
-        <w:pBdr>
-          <w:top w:val="nil"/>
-          <w:left w:val="nil"/>
-          <w:bottom w:val="nil"/>
-          <w:right w:val="nil"/>
-          <w:between w:val="nil"/>
-        </w:pBdr>
-        <w:spacing w:after="0" w:line="360" w:lineRule="auto"/>
+        <w:t>а</w:t>
+      </w:r>
+      <w:r>
         <w:rPr>
           <w:rFonts w:ascii="Times New Roman" w:eastAsia="Times New Roman" w:hAnsi="Times New Roman" w:cs="Times New Roman"/>
           <w:b/>
@@ -4455,20 +4862,165 @@
           <w:sz w:val="28"/>
           <w:szCs w:val="28"/>
         </w:rPr>
-      </w:pPr>
-    </w:p>
-    <w:p>
-      <w:pPr>
-        <w:keepNext/>
-        <w:keepLines/>
-        <w:pBdr>
-          <w:top w:val="nil"/>
-          <w:left w:val="nil"/>
-          <w:bottom w:val="nil"/>
-          <w:right w:val="nil"/>
-          <w:between w:val="nil"/>
-        </w:pBdr>
-        <w:spacing w:after="0" w:line="360" w:lineRule="auto"/>
+        <w:t xml:space="preserve"> на проделанные работы:</w:t>
+      </w:r>
+      <w:r>
+        <w:rPr>
+          <w:rFonts w:ascii="Times New Roman" w:eastAsia="Times New Roman" w:hAnsi="Times New Roman" w:cs="Times New Roman"/>
+          <w:color w:val="000000"/>
+          <w:sz w:val="28"/>
+          <w:szCs w:val="28"/>
+        </w:rPr>
+        <w:br/>
+      </w:r>
+      <w:r>
+        <w:rPr>
+          <w:rFonts w:ascii="Times New Roman" w:eastAsia="Times New Roman" w:hAnsi="Times New Roman" w:cs="Times New Roman"/>
+          <w:color w:val="000000"/>
+          <w:sz w:val="28"/>
+          <w:szCs w:val="28"/>
+          <w:lang w:val="en-US"/>
+        </w:rPr>
+        <w:t>G</w:t>
+      </w:r>
+      <w:r>
+        <w:rPr>
+          <w:rFonts w:ascii="Times New Roman" w:eastAsia="Times New Roman" w:hAnsi="Times New Roman" w:cs="Times New Roman"/>
+          <w:color w:val="000000"/>
+          <w:sz w:val="28"/>
+          <w:szCs w:val="28"/>
+          <w:lang w:val="en-US"/>
+        </w:rPr>
+        <w:t>it</w:t>
+      </w:r>
+      <w:r>
+        <w:rPr>
+          <w:rFonts w:ascii="Times New Roman" w:eastAsia="Times New Roman" w:hAnsi="Times New Roman" w:cs="Times New Roman"/>
+          <w:color w:val="000000"/>
+          <w:sz w:val="28"/>
+          <w:szCs w:val="28"/>
+          <w:lang w:val="en-US"/>
+        </w:rPr>
+        <w:t>H</w:t>
+      </w:r>
+      <w:r>
+        <w:rPr>
+          <w:rFonts w:ascii="Times New Roman" w:eastAsia="Times New Roman" w:hAnsi="Times New Roman" w:cs="Times New Roman"/>
+          <w:color w:val="000000"/>
+          <w:sz w:val="28"/>
+          <w:szCs w:val="28"/>
+          <w:lang w:val="en-US"/>
+        </w:rPr>
+        <w:t>ub</w:t>
+      </w:r>
+      <w:r>
+        <w:rPr>
+          <w:rFonts w:ascii="Times New Roman" w:eastAsia="Times New Roman" w:hAnsi="Times New Roman" w:cs="Times New Roman"/>
+          <w:color w:val="000000"/>
+          <w:sz w:val="28"/>
+          <w:szCs w:val="28"/>
+        </w:rPr>
+        <w:t xml:space="preserve"> репозиторий</w:t>
+      </w:r>
+      <w:r>
+        <w:rPr>
+          <w:rFonts w:ascii="Times New Roman" w:eastAsia="Times New Roman" w:hAnsi="Times New Roman" w:cs="Times New Roman"/>
+          <w:color w:val="000000"/>
+          <w:sz w:val="28"/>
+          <w:szCs w:val="28"/>
+        </w:rPr>
+        <w:t xml:space="preserve"> - </w:t>
+      </w:r>
+      <w:hyperlink r:id="rId9" w:history="1">
+        <w:r>
+          <w:rPr>
+            <w:rStyle w:val="a8"/>
+            <w:rFonts w:ascii="Times New Roman" w:eastAsia="Times New Roman" w:hAnsi="Times New Roman" w:cs="Times New Roman"/>
+            <w:sz w:val="28"/>
+            <w:szCs w:val="28"/>
+          </w:rPr>
+          <w:t>https://github.com/skywkie/practice-2025-1</w:t>
+        </w:r>
+      </w:hyperlink>
+      <w:r>
+        <w:rPr>
+          <w:rFonts w:ascii="Times New Roman" w:eastAsia="Times New Roman" w:hAnsi="Times New Roman" w:cs="Times New Roman"/>
+          <w:color w:val="000000"/>
+          <w:sz w:val="28"/>
+          <w:szCs w:val="28"/>
+        </w:rPr>
+        <w:br/>
+      </w:r>
+      <w:r>
+        <w:rPr>
+          <w:rFonts w:ascii="Times New Roman" w:eastAsia="Times New Roman" w:hAnsi="Times New Roman" w:cs="Times New Roman"/>
+          <w:color w:val="000000"/>
+          <w:sz w:val="28"/>
+          <w:szCs w:val="28"/>
+        </w:rPr>
+        <w:t>С</w:t>
+      </w:r>
+      <w:r>
+        <w:rPr>
+          <w:rFonts w:ascii="Times New Roman" w:eastAsia="Times New Roman" w:hAnsi="Times New Roman" w:cs="Times New Roman"/>
+          <w:color w:val="000000"/>
+          <w:sz w:val="28"/>
+          <w:szCs w:val="28"/>
+        </w:rPr>
+        <w:t xml:space="preserve">айт </w:t>
+      </w:r>
+      <w:proofErr w:type="spellStart"/>
+      <w:r>
+        <w:rPr>
+          <w:rFonts w:ascii="Times New Roman" w:eastAsia="Times New Roman" w:hAnsi="Times New Roman" w:cs="Times New Roman"/>
+          <w:color w:val="000000"/>
+          <w:sz w:val="28"/>
+          <w:szCs w:val="28"/>
+          <w:lang w:val="en-US"/>
+        </w:rPr>
+        <w:t>S</w:t>
+      </w:r>
+      <w:r>
+        <w:rPr>
+          <w:rFonts w:ascii="Times New Roman" w:eastAsia="Times New Roman" w:hAnsi="Times New Roman" w:cs="Times New Roman"/>
+          <w:color w:val="000000"/>
+          <w:sz w:val="28"/>
+          <w:szCs w:val="28"/>
+          <w:lang w:val="en-US"/>
+        </w:rPr>
+        <w:t>yllabica</w:t>
+      </w:r>
+      <w:proofErr w:type="spellEnd"/>
+      <w:r>
+        <w:rPr>
+          <w:rFonts w:ascii="Times New Roman" w:eastAsia="Times New Roman" w:hAnsi="Times New Roman" w:cs="Times New Roman"/>
+          <w:color w:val="000000"/>
+          <w:sz w:val="28"/>
+          <w:szCs w:val="28"/>
+        </w:rPr>
+        <w:t xml:space="preserve"> - </w:t>
+      </w:r>
+      <w:hyperlink r:id="rId10" w:history="1">
+        <w:r>
+          <w:rPr>
+            <w:rStyle w:val="a8"/>
+            <w:rFonts w:ascii="Times New Roman" w:eastAsia="Times New Roman" w:hAnsi="Times New Roman" w:cs="Times New Roman"/>
+            <w:sz w:val="28"/>
+            <w:szCs w:val="28"/>
+          </w:rPr>
+          <w:t>https://syllabica.com/</w:t>
+        </w:r>
+      </w:hyperlink>
+      <w:r>
+        <w:rPr>
+          <w:rFonts w:ascii="Times New Roman" w:eastAsia="Times New Roman" w:hAnsi="Times New Roman" w:cs="Times New Roman"/>
+          <w:color w:val="000000"/>
+          <w:sz w:val="28"/>
+          <w:szCs w:val="28"/>
+        </w:rPr>
+        <w:tab/>
+      </w:r>
+      <w:r>
         <w:rPr>
           <w:rFonts w:ascii="Times New Roman" w:eastAsia="Times New Roman" w:hAnsi="Times New Roman" w:cs="Times New Roman"/>
           <w:b/>
@@ -4477,119 +5029,13 @@
           <w:sz w:val="28"/>
           <w:szCs w:val="28"/>
         </w:rPr>
-      </w:pPr>
-    </w:p>
-    <w:p>
-      <w:pPr>
-        <w:keepNext/>
-        <w:keepLines/>
-        <w:pBdr>
-          <w:top w:val="nil"/>
-          <w:left w:val="nil"/>
-          <w:bottom w:val="nil"/>
-          <w:right w:val="nil"/>
-          <w:between w:val="nil"/>
-        </w:pBdr>
-        <w:spacing w:after="0" w:line="360" w:lineRule="auto"/>
+        <w:br/>
+      </w:r>
+      <w:r>
         <w:rPr>
           <w:rFonts w:ascii="Times New Roman" w:eastAsia="Times New Roman" w:hAnsi="Times New Roman" w:cs="Times New Roman"/>
           <w:b/>
           <w:bCs/>
-          <w:color w:val="000000"/>
-          <w:sz w:val="28"/>
-          <w:szCs w:val="28"/>
-        </w:rPr>
-      </w:pPr>
-    </w:p>
-    <w:p>
-      <w:pPr>
-        <w:keepNext/>
-        <w:keepLines/>
-        <w:pBdr>
-          <w:top w:val="nil"/>
-          <w:left w:val="nil"/>
-          <w:bottom w:val="nil"/>
-          <w:right w:val="nil"/>
-          <w:between w:val="nil"/>
-        </w:pBdr>
-        <w:spacing w:after="0" w:line="360" w:lineRule="auto"/>
-        <w:rPr>
-          <w:rFonts w:ascii="Times New Roman" w:eastAsia="Times New Roman" w:hAnsi="Times New Roman" w:cs="Times New Roman"/>
-          <w:b/>
-          <w:bCs/>
-          <w:color w:val="000000"/>
-          <w:sz w:val="28"/>
-          <w:szCs w:val="28"/>
-        </w:rPr>
-      </w:pPr>
-    </w:p>
-    <w:p>
-      <w:pPr>
-        <w:keepNext/>
-        <w:keepLines/>
-        <w:pBdr>
-          <w:top w:val="nil"/>
-          <w:left w:val="nil"/>
-          <w:bottom w:val="nil"/>
-          <w:right w:val="nil"/>
-          <w:between w:val="nil"/>
-        </w:pBdr>
-        <w:spacing w:after="0" w:line="360" w:lineRule="auto"/>
-        <w:rPr>
-          <w:rFonts w:ascii="Times New Roman" w:eastAsia="Times New Roman" w:hAnsi="Times New Roman" w:cs="Times New Roman"/>
-          <w:b/>
-          <w:bCs/>
-          <w:color w:val="000000"/>
-          <w:sz w:val="28"/>
-          <w:szCs w:val="28"/>
-        </w:rPr>
-      </w:pPr>
-    </w:p>
-    <w:p>
-      <w:pPr>
-        <w:keepNext/>
-        <w:keepLines/>
-        <w:pBdr>
-          <w:top w:val="nil"/>
-          <w:left w:val="nil"/>
-          <w:bottom w:val="nil"/>
-          <w:right w:val="nil"/>
-          <w:between w:val="nil"/>
-        </w:pBdr>
-        <w:spacing w:after="0" w:line="360" w:lineRule="auto"/>
-        <w:rPr>
-          <w:rFonts w:ascii="Times New Roman" w:eastAsia="Times New Roman" w:hAnsi="Times New Roman" w:cs="Times New Roman"/>
-          <w:color w:val="000000"/>
-          <w:sz w:val="28"/>
-          <w:szCs w:val="28"/>
-        </w:rPr>
-      </w:pPr>
-      <w:r>
-        <w:rPr>
-          <w:rFonts w:ascii="Times New Roman" w:eastAsia="Times New Roman" w:hAnsi="Times New Roman" w:cs="Times New Roman"/>
-          <w:b/>
-          <w:bCs/>
-          <w:color w:val="000000"/>
-          <w:sz w:val="28"/>
-          <w:szCs w:val="28"/>
-        </w:rPr>
-        <w:lastRenderedPageBreak/>
-        <w:t>ПРИЛОЖЕНИЯ</w:t>
-      </w:r>
-      <w:r>
-        <w:rPr>
-          <w:rFonts w:ascii="Times New Roman" w:eastAsia="Times New Roman" w:hAnsi="Times New Roman" w:cs="Times New Roman"/>
-          <w:b/>
-          <w:bCs/>
-          <w:color w:val="000000"/>
-          <w:sz w:val="28"/>
-          <w:szCs w:val="28"/>
-        </w:rPr>
-        <w:br/>
-      </w:r>
-      <w:r>
-        <w:rPr>
-          <w:rFonts w:ascii="Times New Roman" w:eastAsia="Times New Roman" w:hAnsi="Times New Roman" w:cs="Times New Roman"/>
           <w:color w:val="000000"/>
           <w:sz w:val="28"/>
           <w:szCs w:val="28"/>
@@ -4616,9 +5062,9 @@
           <w:bdr w:val="none" w:sz="0" w:space="0" w:color="auto" w:frame="1"/>
         </w:rPr>
         <w:drawing>
-          <wp:inline distT="0" distB="0" distL="0" distR="0" wp14:anchorId="7B872DA3" wp14:editId="317D0013">
-            <wp:extent cx="5736590" cy="3820795"/>
-            <wp:effectExtent l="0" t="0" r="0" b="8255"/>
+          <wp:inline distT="0" distB="0" distL="0" distR="0" wp14:anchorId="7B872DA3" wp14:editId="62DD65EB">
+            <wp:extent cx="5736590" cy="3695700"/>
+            <wp:effectExtent l="0" t="0" r="0" b="0"/>
             <wp:docPr id="118846936" name="Рисунок 3"/>
             <wp:cNvGraphicFramePr>
               <a:graphicFrameLocks xmlns:a="http://schemas.openxmlformats.org/drawingml/2006/main" noChangeAspect="1"/>
@@ -4633,7 +5079,7 @@
                     </pic:cNvPicPr>
                   </pic:nvPicPr>
                   <pic:blipFill>
-                    <a:blip r:embed="rId9">
+                    <a:blip r:embed="rId11">
                       <a:extLst>
                         <a:ext uri="{28A0092B-C50C-407E-A947-70E740481C1C}">
                           <a14:useLocalDpi xmlns:a14="http://schemas.microsoft.com/office/drawing/2010/main" val="0"/>
@@ -4648,7 +5094,7 @@
                   <pic:spPr bwMode="auto">
                     <a:xfrm>
                       <a:off x="0" y="0"/>
-                      <a:ext cx="5736590" cy="3820795"/>
+                      <a:ext cx="5736590" cy="3695700"/>
                     </a:xfrm>
                     <a:prstGeom prst="rect">
                       <a:avLst/>
@@ -4684,9 +5130,9 @@
           <w:bdr w:val="none" w:sz="0" w:space="0" w:color="auto" w:frame="1"/>
         </w:rPr>
         <w:drawing>
-          <wp:inline distT="0" distB="0" distL="0" distR="0" wp14:anchorId="2890DA7D" wp14:editId="440A3E7E">
-            <wp:extent cx="5735955" cy="3165475"/>
-            <wp:effectExtent l="0" t="0" r="0" b="0"/>
+          <wp:inline distT="0" distB="0" distL="0" distR="0" wp14:anchorId="2890DA7D" wp14:editId="48C78867">
+            <wp:extent cx="5735955" cy="3063240"/>
+            <wp:effectExtent l="0" t="0" r="0" b="3810"/>
             <wp:docPr id="648777031" name="Рисунок 5"/>
             <wp:cNvGraphicFramePr>
               <a:graphicFrameLocks xmlns:a="http://schemas.openxmlformats.org/drawingml/2006/main" noChangeAspect="1"/>
@@ -4701,7 +5147,7 @@
                     </pic:cNvPicPr>
                   </pic:nvPicPr>
                   <pic:blipFill>
-                    <a:blip r:embed="rId10">
+                    <a:blip r:embed="rId12">
                       <a:extLst>
                         <a:ext uri="{28A0092B-C50C-407E-A947-70E740481C1C}">
                           <a14:useLocalDpi xmlns:a14="http://schemas.microsoft.com/office/drawing/2010/main" val="0"/>
@@ -4716,7 +5162,7 @@
                   <pic:spPr bwMode="auto">
                     <a:xfrm>
                       <a:off x="0" y="0"/>
-                      <a:ext cx="5735955" cy="3165475"/>
+                      <a:ext cx="5735955" cy="3063240"/>
                     </a:xfrm>
                     <a:prstGeom prst="rect">
                       <a:avLst/>
@@ -4770,7 +5216,7 @@
                     </pic:cNvPicPr>
                   </pic:nvPicPr>
                   <pic:blipFill>
-                    <a:blip r:embed="rId11">
+                    <a:blip r:embed="rId13">
                       <a:extLst>
                         <a:ext uri="{28A0092B-C50C-407E-A947-70E740481C1C}">
                           <a14:useLocalDpi xmlns:a14="http://schemas.microsoft.com/office/drawing/2010/main" val="0"/>
@@ -4838,7 +5284,7 @@
                     </pic:cNvPicPr>
                   </pic:nvPicPr>
                   <pic:blipFill>
-                    <a:blip r:embed="rId12">
+                    <a:blip r:embed="rId14">
                       <a:extLst>
                         <a:ext uri="{28A0092B-C50C-407E-A947-70E740481C1C}">
                           <a14:useLocalDpi xmlns:a14="http://schemas.microsoft.com/office/drawing/2010/main" val="0"/>
@@ -4970,7 +5416,7 @@
                     </pic:cNvPicPr>
                   </pic:nvPicPr>
                   <pic:blipFill>
-                    <a:blip r:embed="rId13">
+                    <a:blip r:embed="rId15">
                       <a:extLst>
                         <a:ext uri="{28A0092B-C50C-407E-A947-70E740481C1C}">
                           <a14:useLocalDpi xmlns:a14="http://schemas.microsoft.com/office/drawing/2010/main" val="0"/>
@@ -5038,7 +5484,7 @@
                     </pic:cNvPicPr>
                   </pic:nvPicPr>
                   <pic:blipFill>
-                    <a:blip r:embed="rId14">
+                    <a:blip r:embed="rId16">
                       <a:extLst>
                         <a:ext uri="{28A0092B-C50C-407E-A947-70E740481C1C}">
                           <a14:useLocalDpi xmlns:a14="http://schemas.microsoft.com/office/drawing/2010/main" val="0"/>
@@ -5071,7 +5517,7 @@
       </w:r>
     </w:p>
     <w:sectPr>
-      <w:footerReference w:type="default" r:id="rId15"/>
+      <w:footerReference w:type="default" r:id="rId17"/>
       <w:pgSz w:w="11906" w:h="16838"/>
       <w:pgMar w:top="1134" w:right="850" w:bottom="1134" w:left="1134" w:header="708" w:footer="708" w:gutter="0"/>
       <w:pgNumType w:start="1"/>
@@ -9535,6 +9981,18 @@
       <w:shd w:val="clear" w:color="auto" w:fill="E1DFDD"/>
     </w:rPr>
   </w:style>
+  <w:style w:type="character" w:styleId="ae">
+    <w:name w:val="FollowedHyperlink"/>
+    <w:basedOn w:val="a0"/>
+    <w:uiPriority w:val="99"/>
+    <w:semiHidden/>
+    <w:unhideWhenUsed/>
+    <w:rsid w:val="00562C14"/>
+    <w:rPr>
+      <w:color w:val="800080" w:themeColor="followedHyperlink"/>
+      <w:u w:val="single"/>
+    </w:rPr>
+  </w:style>
 </w:styles>
 </file>
 

</xml_diff>